<commit_message>
902 chua co gqvl
</commit_message>
<xml_diff>
--- a/HOSONHCS/01 HN.docx
+++ b/HOSONHCS/01 HN.docx
@@ -1297,7 +1297,6 @@
     </w:p>
     <w:p>
       <w:pPr>
-        <w:spacing w:before="176"/>
         <w:ind w:left="260"/>
         <w:rPr>
           <w:i/>
@@ -1347,7 +1346,7 @@
     <w:p>
       <w:pPr>
         <w:pStyle w:val="BodyText"/>
-        <w:spacing w:before="4"/>
+        <w:spacing w:before="0"/>
         <w:ind w:right="1402"/>
       </w:pPr>
       <w:r>
@@ -1369,7 +1368,7 @@
     <w:p>
       <w:pPr>
         <w:pStyle w:val="BodyText"/>
-        <w:spacing w:before="4"/>
+        <w:spacing w:before="0"/>
         <w:ind w:right="1402"/>
       </w:pPr>
       <w:r>
@@ -1419,7 +1418,13 @@
         <w:t xml:space="preserve"> </w:t>
       </w:r>
       <w:r>
-        <w:t>đồng/lần. Hạn trả nợ cuối cùng: Ngày</w:t>
+        <w:t xml:space="preserve">đồng/lần. </w:t>
+      </w:r>
+      <w:r>
+        <w:t>{{kycuoi_block}}Số tiền trả kỳ cuối:……………..đồng.{{/kycuoi_block}}</w:t>
+      </w:r>
+      <w:r>
+        <w:t>Hạn trả nợ cuối cùng: Ngày</w:t>
       </w:r>
       <w:r>
         <w:t>:…./…./……..</w:t>
@@ -1452,7 +1457,6 @@
     </w:p>
     <w:p>
       <w:pPr>
-        <w:spacing w:before="3" w:after="14"/>
         <w:ind w:left="6291"/>
         <w:rPr>
           <w:i/>
@@ -1530,7 +1534,6 @@
           <w:p>
             <w:pPr>
               <w:pStyle w:val="TableParagraph"/>
-              <w:spacing w:line="265" w:lineRule="exact"/>
               <w:ind w:left="18"/>
               <w:rPr>
                 <w:b/>
@@ -1548,7 +1551,6 @@
           <w:p>
             <w:pPr>
               <w:pStyle w:val="TableParagraph"/>
-              <w:spacing w:line="275" w:lineRule="exact"/>
               <w:ind w:left="0"/>
               <w:rPr>
                 <w:i/>
@@ -1571,7 +1573,6 @@
           <w:p>
             <w:pPr>
               <w:pStyle w:val="TableParagraph"/>
-              <w:spacing w:line="237" w:lineRule="auto"/>
               <w:ind w:left="0" w:right="45"/>
               <w:rPr>
                 <w:b/>
@@ -1589,7 +1590,6 @@
           <w:p>
             <w:pPr>
               <w:pStyle w:val="TableParagraph"/>
-              <w:spacing w:line="237" w:lineRule="auto"/>
               <w:ind w:left="0" w:right="45"/>
               <w:rPr>
                 <w:b/>
@@ -1607,7 +1607,6 @@
           <w:p>
             <w:pPr>
               <w:pStyle w:val="TableParagraph"/>
-              <w:spacing w:line="237" w:lineRule="auto"/>
               <w:ind w:left="0" w:right="45"/>
               <w:rPr>
                 <w:i/>
@@ -1630,7 +1629,6 @@
           <w:p>
             <w:pPr>
               <w:pStyle w:val="TableParagraph"/>
-              <w:spacing w:line="265" w:lineRule="exact"/>
               <w:ind w:left="0" w:right="-51"/>
               <w:rPr>
                 <w:b/>
@@ -1648,7 +1646,6 @@
           <w:p>
             <w:pPr>
               <w:pStyle w:val="TableParagraph"/>
-              <w:spacing w:line="275" w:lineRule="exact"/>
               <w:ind w:left="0" w:right="-51"/>
               <w:rPr>
                 <w:i/>

</xml_diff>